<commit_message>
Update CV; Update Publication
</commit_message>
<xml_diff>
--- a/H.Wan. CV (Fall 2025).docx
+++ b/H.Wan. CV (Fall 2025).docx
@@ -1,6 +1,6 @@
 
 <file path=word/document.xml><?xml version="1.0" encoding="utf-8"?>
-<w:document xmlns:wpc="http://schemas.microsoft.com/office/word/2010/wordprocessingCanvas" xmlns:cx="http://schemas.microsoft.com/office/drawing/2014/chartex" xmlns:cx1="http://schemas.microsoft.com/office/drawing/2015/9/8/chartex" xmlns:cx2="http://schemas.microsoft.com/office/drawing/2015/10/21/chartex" xmlns:cx3="http://schemas.microsoft.com/office/drawing/2016/5/9/chartex" xmlns:cx4="http://schemas.microsoft.com/office/drawing/2016/5/10/chartex" xmlns:cx5="http://schemas.microsoft.com/office/drawing/2016/5/11/chartex" xmlns:cx6="http://schemas.microsoft.com/office/drawing/2016/5/12/chartex" xmlns:cx7="http://schemas.microsoft.com/office/drawing/2016/5/13/chartex" xmlns:cx8="http://schemas.microsoft.com/office/drawing/2016/5/14/chartex" xmlns:mc="http://schemas.openxmlformats.org/markup-compatibility/2006" xmlns:aink="http://schemas.microsoft.com/office/drawing/2016/ink" xmlns:am3d="http://schemas.microsoft.com/office/drawing/2017/model3d" xmlns:o="urn:schemas-microsoft-com:office:office" xmlns:oel="http://schemas.microsoft.com/office/2019/extlst" xmlns:r="http://schemas.openxmlformats.org/officeDocument/2006/relationships" xmlns:m="http://schemas.openxmlformats.org/officeDocument/2006/math" xmlns:v="urn:schemas-microsoft-com:vml" xmlns:wp14="http://schemas.microsoft.com/office/word/2010/wordprocessingDrawing" xmlns:wp="http://schemas.openxmlformats.org/drawingml/2006/wordprocessingDrawing" xmlns:w10="urn:schemas-microsoft-com:office:word" xmlns:w="http://schemas.openxmlformats.org/wordprocessingml/2006/main" xmlns:w14="http://schemas.microsoft.com/office/word/2010/wordml" xmlns:w15="http://schemas.microsoft.com/office/word/2012/wordml" xmlns:w16cex="http://schemas.microsoft.com/office/word/2018/wordml/cex" xmlns:w16cid="http://schemas.microsoft.com/office/word/2016/wordml/cid" xmlns:w16="http://schemas.microsoft.com/office/word/2018/wordml" xmlns:w16du="http://schemas.microsoft.com/office/word/2023/wordml/word16du" xmlns:w16sdtdh="http://schemas.microsoft.com/office/word/2020/wordml/sdtdatahash" xmlns:w16se="http://schemas.microsoft.com/office/word/2015/wordml/symex" xmlns:wpg="http://schemas.microsoft.com/office/word/2010/wordprocessingGroup" xmlns:wpi="http://schemas.microsoft.com/office/word/2010/wordprocessingInk" xmlns:wne="http://schemas.microsoft.com/office/word/2006/wordml" xmlns:wps="http://schemas.microsoft.com/office/word/2010/wordprocessingShape" mc:Ignorable="w14 w15 w16se w16cid w16 w16cex w16sdtdh w16du wp14">
+<w:document xmlns:wpc="http://schemas.microsoft.com/office/word/2010/wordprocessingCanvas" xmlns:cx="http://schemas.microsoft.com/office/drawing/2014/chartex" xmlns:cx1="http://schemas.microsoft.com/office/drawing/2015/9/8/chartex" xmlns:cx2="http://schemas.microsoft.com/office/drawing/2015/10/21/chartex" xmlns:cx3="http://schemas.microsoft.com/office/drawing/2016/5/9/chartex" xmlns:cx4="http://schemas.microsoft.com/office/drawing/2016/5/10/chartex" xmlns:cx5="http://schemas.microsoft.com/office/drawing/2016/5/11/chartex" xmlns:cx6="http://schemas.microsoft.com/office/drawing/2016/5/12/chartex" xmlns:cx7="http://schemas.microsoft.com/office/drawing/2016/5/13/chartex" xmlns:cx8="http://schemas.microsoft.com/office/drawing/2016/5/14/chartex" xmlns:mc="http://schemas.openxmlformats.org/markup-compatibility/2006" xmlns:aink="http://schemas.microsoft.com/office/drawing/2016/ink" xmlns:am3d="http://schemas.microsoft.com/office/drawing/2017/model3d" xmlns:o="urn:schemas-microsoft-com:office:office" xmlns:oel="http://schemas.microsoft.com/office/2019/extlst" xmlns:r="http://schemas.openxmlformats.org/officeDocument/2006/relationships" xmlns:m="http://schemas.openxmlformats.org/officeDocument/2006/math" xmlns:v="urn:schemas-microsoft-com:vml" xmlns:wp14="http://schemas.microsoft.com/office/word/2010/wordprocessingDrawing" xmlns:wp="http://schemas.openxmlformats.org/drawingml/2006/wordprocessingDrawing" xmlns:w10="urn:schemas-microsoft-com:office:word" xmlns:w="http://schemas.openxmlformats.org/wordprocessingml/2006/main" xmlns:w14="http://schemas.microsoft.com/office/word/2010/wordml" xmlns:w15="http://schemas.microsoft.com/office/word/2012/wordml" xmlns:w16cex="http://schemas.microsoft.com/office/word/2018/wordml/cex" xmlns:w16cid="http://schemas.microsoft.com/office/word/2016/wordml/cid" xmlns:w16="http://schemas.microsoft.com/office/word/2018/wordml" xmlns:w16du="http://schemas.microsoft.com/office/word/2023/wordml/word16du" xmlns:w16sdtdh="http://schemas.microsoft.com/office/word/2020/wordml/sdtdatahash" xmlns:w16sdtfl="http://schemas.microsoft.com/office/word/2024/wordml/sdtformatlock" xmlns:w16se="http://schemas.microsoft.com/office/word/2015/wordml/symex" xmlns:wpg="http://schemas.microsoft.com/office/word/2010/wordprocessingGroup" xmlns:wpi="http://schemas.microsoft.com/office/word/2010/wordprocessingInk" xmlns:wne="http://schemas.microsoft.com/office/word/2006/wordml" xmlns:wps="http://schemas.microsoft.com/office/word/2010/wordprocessingShape" mc:Ignorable="w14 w15 w16se w16cid w16 w16cex w16sdtdh w16sdtfl w16du wp14">
   <w:body>
     <w:p>
       <w:pPr>
@@ -1208,25 +1208,7 @@
                 <w:i/>
                 <w:iCs/>
               </w:rPr>
-              <w:t xml:space="preserve">Sallie P. </w:t>
-            </w:r>
-            <w:proofErr w:type="spellStart"/>
-            <w:r>
-              <w:rPr>
-                <w:rFonts w:ascii="Garamond" w:hAnsi="Garamond"/>
-                <w:i/>
-                <w:iCs/>
-              </w:rPr>
-              <w:t>Asche</w:t>
-            </w:r>
-            <w:proofErr w:type="spellEnd"/>
-            <w:r>
-              <w:rPr>
-                <w:rFonts w:ascii="Garamond" w:hAnsi="Garamond"/>
-                <w:i/>
-                <w:iCs/>
-              </w:rPr>
-              <w:t xml:space="preserve"> Travel Awards</w:t>
+              <w:t>Sallie P. Asche Travel Awards</w:t>
             </w:r>
             <w:r>
               <w:rPr>
@@ -3681,7 +3663,7 @@
           <w:sz w:val="26"/>
           <w:szCs w:val="26"/>
         </w:rPr>
-        <w:t>Internship</w:t>
+        <w:t>Applied Research &amp; Data Science Experience</w:t>
       </w:r>
     </w:p>
     <w:tbl>
@@ -4181,35 +4163,23 @@
         <w:ind w:left="288" w:hanging="288"/>
         <w:rPr>
           <w:rFonts w:ascii="Garamond" w:hAnsi="Garamond"/>
-        </w:rPr>
-      </w:pPr>
-      <w:r>
-        <w:rPr>
-          <w:rFonts w:ascii="Garamond" w:hAnsi="Garamond"/>
           <w:b/>
           <w:bCs/>
         </w:rPr>
-        <w:t>Wan, H.,</w:t>
-      </w:r>
-      <w:r>
-        <w:rPr>
-          <w:rFonts w:ascii="Garamond" w:hAnsi="Garamond"/>
-        </w:rPr>
-        <w:t xml:space="preserve"> Myerson, J., Green, L., Strube, M. J., &amp; Hale, S. (</w:t>
-      </w:r>
-      <w:r>
-        <w:rPr>
-          <w:rFonts w:ascii="Garamond" w:hAnsi="Garamond"/>
-          <w:color w:val="000000"/>
-          <w:kern w:val="1"/>
-        </w:rPr>
-        <w:t>2025</w:t>
-      </w:r>
-      <w:r>
-        <w:rPr>
-          <w:rFonts w:ascii="Garamond" w:hAnsi="Garamond"/>
-        </w:rPr>
-        <w:t xml:space="preserve">). Age, income, and the discounting of delayed monetary losses. </w:t>
+      </w:pPr>
+      <w:r>
+        <w:rPr>
+          <w:rFonts w:ascii="Garamond" w:hAnsi="Garamond"/>
+          <w:b/>
+          <w:bCs/>
+        </w:rPr>
+        <w:t xml:space="preserve">Wan, H., </w:t>
+      </w:r>
+      <w:r>
+        <w:rPr>
+          <w:rFonts w:ascii="Garamond" w:hAnsi="Garamond"/>
+        </w:rPr>
+        <w:t xml:space="preserve">Green, L., &amp; Myerson, J. (2025). Brief Assessments of Delay Discounting: Two-Amount Monetary Choice and Delayed Losses Questionnaires. </w:t>
       </w:r>
       <w:r>
         <w:rPr>
@@ -4217,13 +4187,62 @@
           <w:i/>
           <w:iCs/>
         </w:rPr>
-        <w:t xml:space="preserve">The Journals of Gerontology: Series B, Psychological Sciences and Social Sciences, </w:t>
-      </w:r>
-      <w:r>
-        <w:rPr>
-          <w:rFonts w:ascii="Garamond" w:hAnsi="Garamond"/>
-        </w:rPr>
-        <w:t>Article gbaf162</w:t>
+        <w:t>The Psychological Record</w:t>
+      </w:r>
+      <w:r>
+        <w:rPr>
+          <w:rFonts w:ascii="Garamond" w:hAnsi="Garamond"/>
+        </w:rPr>
+        <w:t>, 1-7.</w:t>
+      </w:r>
+      <w:r>
+        <w:rPr>
+          <w:rFonts w:ascii="Garamond" w:hAnsi="Garamond"/>
+        </w:rPr>
+        <w:t xml:space="preserve"> </w:t>
+      </w:r>
+      <w:r>
+        <w:rPr>
+          <w:rFonts w:ascii="Garamond" w:hAnsi="Garamond"/>
+        </w:rPr>
+        <w:t>https://doi.org/10.1007/s40732-025-00665-w</w:t>
+      </w:r>
+    </w:p>
+    <w:p>
+      <w:pPr>
+        <w:spacing w:line="276" w:lineRule="auto"/>
+        <w:ind w:left="288" w:hanging="288"/>
+        <w:rPr>
+          <w:rFonts w:ascii="Garamond" w:hAnsi="Garamond"/>
+        </w:rPr>
+      </w:pPr>
+      <w:r>
+        <w:rPr>
+          <w:rFonts w:ascii="Garamond" w:hAnsi="Garamond"/>
+          <w:b/>
+          <w:bCs/>
+        </w:rPr>
+        <w:t>Wan, H.,</w:t>
+      </w:r>
+      <w:r>
+        <w:rPr>
+          <w:rFonts w:ascii="Garamond" w:hAnsi="Garamond"/>
+        </w:rPr>
+        <w:t xml:space="preserve"> Myerson, J., Green, L., Strube, M. J., &amp; Hale, S. (</w:t>
+      </w:r>
+      <w:r>
+        <w:rPr>
+          <w:rFonts w:ascii="Garamond" w:hAnsi="Garamond"/>
+          <w:color w:val="000000"/>
+          <w:kern w:val="1"/>
+        </w:rPr>
+        <w:t>2025</w:t>
+      </w:r>
+      <w:r>
+        <w:rPr>
+          <w:rFonts w:ascii="Garamond" w:hAnsi="Garamond"/>
+        </w:rPr>
+        <w:t xml:space="preserve">). Age, income, and the discounting of delayed monetary losses. </w:t>
       </w:r>
       <w:r>
         <w:rPr>
@@ -4231,6 +4250,20 @@
           <w:i/>
           <w:iCs/>
         </w:rPr>
+        <w:t xml:space="preserve">The Journals of Gerontology: Series B, Psychological Sciences and Social Sciences, </w:t>
+      </w:r>
+      <w:r>
+        <w:rPr>
+          <w:rFonts w:ascii="Garamond" w:hAnsi="Garamond"/>
+        </w:rPr>
+        <w:t>Article gbaf162</w:t>
+      </w:r>
+      <w:r>
+        <w:rPr>
+          <w:rFonts w:ascii="Garamond" w:hAnsi="Garamond"/>
+          <w:i/>
+          <w:iCs/>
+        </w:rPr>
         <w:t>.</w:t>
       </w:r>
       <w:r>
@@ -4841,13 +4874,14 @@
           <w:b/>
           <w:bCs/>
         </w:rPr>
+        <w:lastRenderedPageBreak/>
         <w:t>Wan, H.,</w:t>
       </w:r>
       <w:r>
         <w:rPr>
           <w:rFonts w:ascii="Garamond" w:hAnsi="Garamond"/>
         </w:rPr>
-        <w:t xml:space="preserve"> Myerson, J., &amp; Green, L. (</w:t>
+        <w:t xml:space="preserve"> Myerson, J., Green, L., Strube, M. J., &amp; Hale, S. (</w:t>
       </w:r>
       <w:r>
         <w:rPr>
@@ -4863,115 +4897,19 @@
         <w:rPr>
           <w:rFonts w:ascii="Garamond" w:hAnsi="Garamond"/>
         </w:rPr>
-        <w:t xml:space="preserve">). Brief </w:t>
-      </w:r>
-      <w:r>
-        <w:rPr>
-          <w:rFonts w:ascii="Garamond" w:hAnsi="Garamond"/>
-        </w:rPr>
-        <w:t>a</w:t>
-      </w:r>
-      <w:r>
-        <w:rPr>
-          <w:rFonts w:ascii="Garamond" w:hAnsi="Garamond"/>
-        </w:rPr>
-        <w:t xml:space="preserve">ssessments of </w:t>
-      </w:r>
-      <w:r>
-        <w:rPr>
-          <w:rFonts w:ascii="Garamond" w:hAnsi="Garamond"/>
-        </w:rPr>
-        <w:t>d</w:t>
-      </w:r>
-      <w:r>
-        <w:rPr>
-          <w:rFonts w:ascii="Garamond" w:hAnsi="Garamond"/>
-        </w:rPr>
-        <w:t xml:space="preserve">elay </w:t>
-      </w:r>
-      <w:r>
-        <w:rPr>
-          <w:rFonts w:ascii="Garamond" w:hAnsi="Garamond"/>
-        </w:rPr>
-        <w:t>d</w:t>
-      </w:r>
-      <w:r>
-        <w:rPr>
-          <w:rFonts w:ascii="Garamond" w:hAnsi="Garamond"/>
-        </w:rPr>
-        <w:t>iscounting: Two-</w:t>
-      </w:r>
-      <w:r>
-        <w:rPr>
-          <w:rFonts w:ascii="Garamond" w:hAnsi="Garamond"/>
-        </w:rPr>
-        <w:t>a</w:t>
-      </w:r>
-      <w:r>
-        <w:rPr>
-          <w:rFonts w:ascii="Garamond" w:hAnsi="Garamond"/>
-        </w:rPr>
-        <w:t xml:space="preserve">mount </w:t>
-      </w:r>
-      <w:r>
-        <w:rPr>
-          <w:rFonts w:ascii="Garamond" w:hAnsi="Garamond"/>
-        </w:rPr>
-        <w:t>m</w:t>
-      </w:r>
-      <w:r>
-        <w:rPr>
-          <w:rFonts w:ascii="Garamond" w:hAnsi="Garamond"/>
-        </w:rPr>
-        <w:t xml:space="preserve">onetary </w:t>
-      </w:r>
-      <w:r>
-        <w:rPr>
-          <w:rFonts w:ascii="Garamond" w:hAnsi="Garamond"/>
-        </w:rPr>
-        <w:t>c</w:t>
-      </w:r>
-      <w:r>
-        <w:rPr>
-          <w:rFonts w:ascii="Garamond" w:hAnsi="Garamond"/>
-        </w:rPr>
-        <w:t xml:space="preserve">hoice and </w:t>
-      </w:r>
-      <w:r>
-        <w:rPr>
-          <w:rFonts w:ascii="Garamond" w:hAnsi="Garamond"/>
-        </w:rPr>
-        <w:t>d</w:t>
-      </w:r>
-      <w:r>
-        <w:rPr>
-          <w:rFonts w:ascii="Garamond" w:hAnsi="Garamond"/>
-        </w:rPr>
-        <w:t xml:space="preserve">elayed </w:t>
-      </w:r>
-      <w:r>
-        <w:rPr>
-          <w:rFonts w:ascii="Garamond" w:hAnsi="Garamond"/>
-        </w:rPr>
-        <w:t>l</w:t>
-      </w:r>
-      <w:r>
-        <w:rPr>
-          <w:rFonts w:ascii="Garamond" w:hAnsi="Garamond"/>
-        </w:rPr>
-        <w:t xml:space="preserve">osses </w:t>
-      </w:r>
-      <w:r>
-        <w:rPr>
-          <w:rFonts w:ascii="Garamond" w:hAnsi="Garamond"/>
-        </w:rPr>
-        <w:t>q</w:t>
-      </w:r>
-      <w:r>
-        <w:rPr>
-          <w:rFonts w:ascii="Garamond" w:hAnsi="Garamond"/>
-        </w:rPr>
-        <w:t>uestionnaires.</w:t>
+        <w:t xml:space="preserve">). Age, income, and the discounting of delayed </w:t>
+      </w:r>
+      <w:r>
+        <w:rPr>
+          <w:rFonts w:ascii="Garamond" w:hAnsi="Garamond"/>
+        </w:rPr>
+        <w:t>and probabilistic rewards</w:t>
+      </w:r>
+      <w:r>
+        <w:rPr>
+          <w:rFonts w:ascii="Garamond" w:hAnsi="Garamond"/>
+        </w:rPr>
+        <w:t>.</w:t>
       </w:r>
     </w:p>
     <w:p>
@@ -4985,31 +4923,22 @@
       <w:r>
         <w:rPr>
           <w:rFonts w:ascii="Garamond" w:hAnsi="Garamond"/>
-        </w:rPr>
-        <w:lastRenderedPageBreak/>
-        <w:t xml:space="preserve">Myerson, J., Green, L., Vanderveldt, A., &amp; </w:t>
-      </w:r>
-      <w:r>
-        <w:rPr>
-          <w:rFonts w:ascii="Garamond" w:hAnsi="Garamond"/>
           <w:b/>
           <w:bCs/>
         </w:rPr>
-        <w:t>Wan, H.</w:t>
-      </w:r>
-      <w:r>
-        <w:rPr>
-          <w:rFonts w:ascii="Garamond" w:hAnsi="Garamond"/>
-        </w:rPr>
-        <w:t xml:space="preserve"> (</w:t>
+        <w:t xml:space="preserve">Wan, H., </w:t>
+      </w:r>
+      <w:r>
+        <w:rPr>
+          <w:rFonts w:ascii="Garamond" w:hAnsi="Garamond"/>
+        </w:rPr>
+        <w:t>Tan, L., &amp; Hackenberg, T. (</w:t>
       </w:r>
       <w:r>
         <w:rPr>
           <w:rFonts w:ascii="Garamond" w:hAnsi="Garamond"/>
           <w:i/>
           <w:iCs/>
-          <w:color w:val="000000"/>
-          <w:kern w:val="1"/>
         </w:rPr>
         <w:t>under review</w:t>
       </w:r>
@@ -5017,19 +4946,7 @@
         <w:rPr>
           <w:rFonts w:ascii="Garamond" w:hAnsi="Garamond"/>
         </w:rPr>
-        <w:t xml:space="preserve">). </w:t>
-      </w:r>
-      <w:r>
-        <w:rPr>
-          <w:rFonts w:ascii="Garamond" w:hAnsi="Garamond"/>
-        </w:rPr>
-        <w:t>Delay-probability asymmetry in discounting:  An anomaly in multi-attribute choice</w:t>
-      </w:r>
-      <w:r>
-        <w:rPr>
-          <w:rFonts w:ascii="Garamond" w:hAnsi="Garamond"/>
-        </w:rPr>
-        <w:t>.</w:t>
+        <w:t>). Behavioral economic analysis of pigeons’ token accumulation and reinforcer demand in a laboratory-based token economy.</w:t>
       </w:r>
     </w:p>
     <w:p>
@@ -5043,28 +4960,30 @@
       <w:r>
         <w:rPr>
           <w:rFonts w:ascii="Garamond" w:hAnsi="Garamond"/>
+        </w:rPr>
+        <w:t xml:space="preserve">Myerson, J., Green, L., Vanderveldt, A., &amp; </w:t>
+      </w:r>
+      <w:r>
+        <w:rPr>
+          <w:rFonts w:ascii="Garamond" w:hAnsi="Garamond"/>
           <w:b/>
           <w:bCs/>
         </w:rPr>
-        <w:t xml:space="preserve">Wan, H., </w:t>
-      </w:r>
-      <w:r>
-        <w:rPr>
-          <w:rFonts w:ascii="Garamond" w:hAnsi="Garamond"/>
-        </w:rPr>
-        <w:t xml:space="preserve">Tan, L., </w:t>
-      </w:r>
-      <w:r>
-        <w:rPr>
-          <w:rFonts w:ascii="Garamond" w:hAnsi="Garamond"/>
-        </w:rPr>
-        <w:t>&amp; Hackenberg, T. (</w:t>
+        <w:t>Wan, H.</w:t>
+      </w:r>
+      <w:r>
+        <w:rPr>
+          <w:rFonts w:ascii="Garamond" w:hAnsi="Garamond"/>
+        </w:rPr>
+        <w:t xml:space="preserve"> (</w:t>
       </w:r>
       <w:r>
         <w:rPr>
           <w:rFonts w:ascii="Garamond" w:hAnsi="Garamond"/>
           <w:i/>
           <w:iCs/>
+          <w:color w:val="000000"/>
+          <w:kern w:val="1"/>
         </w:rPr>
         <w:t>under review</w:t>
       </w:r>
@@ -5078,7 +4997,13 @@
         <w:rPr>
           <w:rFonts w:ascii="Garamond" w:hAnsi="Garamond"/>
         </w:rPr>
-        <w:t>Behavioral economic analysis of pigeons’ token accumulation and reinforcer demand in a laboratory-based token economy.</w:t>
+        <w:t>Delay-probability asymmetry in discounting:  An anomaly in multi-attribute choice</w:t>
+      </w:r>
+      <w:r>
+        <w:rPr>
+          <w:rFonts w:ascii="Garamond" w:hAnsi="Garamond"/>
+        </w:rPr>
+        <w:t>.</w:t>
       </w:r>
     </w:p>
     <w:p>
@@ -5164,7 +5089,7 @@
         <w:rPr>
           <w:rFonts w:ascii="Garamond" w:hAnsi="Garamond"/>
         </w:rPr>
-        <w:t>Discounting of rewards that are both delayed and probabilistic:</w:t>
+        <w:t>Age, income, and the discounting of rewards that are both delayed and probabilistic:</w:t>
       </w:r>
       <w:r>
         <w:rPr>
@@ -5176,13 +5101,7 @@
         <w:rPr>
           <w:rFonts w:ascii="Garamond" w:hAnsi="Garamond"/>
         </w:rPr>
-        <w:t>The effects of age and financial stress</w:t>
-      </w:r>
-      <w:r>
-        <w:rPr>
-          <w:rFonts w:ascii="Garamond" w:hAnsi="Garamond"/>
-        </w:rPr>
-        <w:t>.</w:t>
+        <w:t>The effects of financial and cognitive resources</w:t>
       </w:r>
     </w:p>
     <w:p>
@@ -5205,7 +5124,7 @@
         <w:rPr>
           <w:rFonts w:ascii="Garamond" w:hAnsi="Garamond"/>
         </w:rPr>
-        <w:t xml:space="preserve"> Myerson, J., Green, L., Strube, M. J., &amp; Hale, S. (</w:t>
+        <w:t xml:space="preserve"> Myerson, J., Green, L. (</w:t>
       </w:r>
       <w:r>
         <w:rPr>
@@ -5221,57 +5140,6 @@
         <w:rPr>
           <w:rFonts w:ascii="Garamond" w:hAnsi="Garamond"/>
         </w:rPr>
-        <w:t xml:space="preserve">). Age, income, and the discounting of delayed </w:t>
-      </w:r>
-      <w:r>
-        <w:rPr>
-          <w:rFonts w:ascii="Garamond" w:hAnsi="Garamond"/>
-        </w:rPr>
-        <w:t>and probabilistic rewards</w:t>
-      </w:r>
-      <w:r>
-        <w:rPr>
-          <w:rFonts w:ascii="Garamond" w:hAnsi="Garamond"/>
-        </w:rPr>
-        <w:t>.</w:t>
-      </w:r>
-    </w:p>
-    <w:p>
-      <w:pPr>
-        <w:spacing w:line="276" w:lineRule="auto"/>
-        <w:ind w:left="288" w:hanging="288"/>
-        <w:rPr>
-          <w:rFonts w:ascii="Garamond" w:hAnsi="Garamond"/>
-        </w:rPr>
-      </w:pPr>
-      <w:r>
-        <w:rPr>
-          <w:rFonts w:ascii="Garamond" w:hAnsi="Garamond"/>
-          <w:b/>
-          <w:bCs/>
-        </w:rPr>
-        <w:t>Wan, H.,</w:t>
-      </w:r>
-      <w:r>
-        <w:rPr>
-          <w:rFonts w:ascii="Garamond" w:hAnsi="Garamond"/>
-        </w:rPr>
-        <w:t xml:space="preserve"> Myerson, J., Green, L. (</w:t>
-      </w:r>
-      <w:r>
-        <w:rPr>
-          <w:rFonts w:ascii="Garamond" w:hAnsi="Garamond"/>
-          <w:i/>
-          <w:iCs/>
-          <w:color w:val="000000"/>
-          <w:kern w:val="1"/>
-        </w:rPr>
-        <w:t>in preparation</w:t>
-      </w:r>
-      <w:r>
-        <w:rPr>
-          <w:rFonts w:ascii="Garamond" w:hAnsi="Garamond"/>
-        </w:rPr>
         <w:t xml:space="preserve">). </w:t>
       </w:r>
       <w:r>
@@ -5286,14 +5154,12 @@
         </w:rPr>
         <w:t xml:space="preserve"> parsimonious simplification of </w:t>
       </w:r>
-      <w:proofErr w:type="spellStart"/>
-      <w:r>
-        <w:rPr>
-          <w:rFonts w:ascii="Garamond" w:hAnsi="Garamond"/>
-        </w:rPr>
-        <w:t>killeen’s</w:t>
-      </w:r>
-      <w:proofErr w:type="spellEnd"/>
+      <w:r>
+        <w:rPr>
+          <w:rFonts w:ascii="Garamond" w:hAnsi="Garamond"/>
+        </w:rPr>
+        <w:t>Killeen’s</w:t>
+      </w:r>
       <w:r>
         <w:rPr>
           <w:rFonts w:ascii="Garamond" w:hAnsi="Garamond"/>
@@ -5908,7 +5774,21 @@
         <w:rPr>
           <w:rFonts w:ascii="Garamond" w:hAnsi="Garamond"/>
         </w:rPr>
-        <w:t>set)?: The effect of subjective scarcity on decision-making [</w:t>
+        <w:t>set</w:t>
+      </w:r>
+      <w:proofErr w:type="gramStart"/>
+      <w:r>
+        <w:rPr>
+          <w:rFonts w:ascii="Garamond" w:hAnsi="Garamond"/>
+        </w:rPr>
+        <w:t>)?:</w:t>
+      </w:r>
+      <w:proofErr w:type="gramEnd"/>
+      <w:r>
+        <w:rPr>
+          <w:rFonts w:ascii="Garamond" w:hAnsi="Garamond"/>
+        </w:rPr>
+        <w:t xml:space="preserve"> The effect of subjective scarcity on decision-making [</w:t>
       </w:r>
       <w:r>
         <w:rPr>
@@ -6236,21 +6116,7 @@
         <w:rPr>
           <w:rFonts w:ascii="Garamond" w:hAnsi="Garamond"/>
         </w:rPr>
-        <w:t xml:space="preserve"> Kirkman, C. F., </w:t>
-      </w:r>
-      <w:proofErr w:type="spellStart"/>
-      <w:r>
-        <w:rPr>
-          <w:rFonts w:ascii="Garamond" w:hAnsi="Garamond"/>
-        </w:rPr>
-        <w:t>Franceschini</w:t>
-      </w:r>
-      <w:proofErr w:type="spellEnd"/>
-      <w:r>
-        <w:rPr>
-          <w:rFonts w:ascii="Garamond" w:hAnsi="Garamond"/>
-        </w:rPr>
-        <w:t xml:space="preserve">, C., &amp; Hackenberg, T. D. (2019, May). Failure to find altruistic behavior in rats [Poster presentation]. </w:t>
+        <w:t xml:space="preserve"> Kirkman, C. F., Franceschini, C., &amp; Hackenberg, T. D. (2019, May). Failure to find altruistic behavior in rats [Poster presentation]. </w:t>
       </w:r>
       <w:r>
         <w:rPr>
@@ -6340,21 +6206,7 @@
         <w:rPr>
           <w:rFonts w:ascii="Garamond" w:hAnsi="Garamond"/>
         </w:rPr>
-        <w:t xml:space="preserve"> </w:t>
-      </w:r>
-      <w:proofErr w:type="spellStart"/>
-      <w:r>
-        <w:rPr>
-          <w:rFonts w:ascii="Garamond" w:hAnsi="Garamond"/>
-        </w:rPr>
-        <w:t>Franceschini</w:t>
-      </w:r>
-      <w:proofErr w:type="spellEnd"/>
-      <w:r>
-        <w:rPr>
-          <w:rFonts w:ascii="Garamond" w:hAnsi="Garamond"/>
-        </w:rPr>
-        <w:t xml:space="preserve">, C., &amp; Hackenberg, T. D. (2019, May). Assessing cross-price interactions between food and social reinforcement [Poster presentation]. </w:t>
+        <w:t xml:space="preserve"> Franceschini, C., &amp; Hackenberg, T. D. (2019, May). Assessing cross-price interactions between food and social reinforcement [Poster presentation]. </w:t>
       </w:r>
       <w:r>
         <w:rPr>
@@ -6399,21 +6251,7 @@
         <w:rPr>
           <w:rFonts w:ascii="Garamond" w:hAnsi="Garamond"/>
         </w:rPr>
-        <w:t xml:space="preserve"> &amp; </w:t>
-      </w:r>
-      <w:proofErr w:type="spellStart"/>
-      <w:r>
-        <w:rPr>
-          <w:rFonts w:ascii="Garamond" w:hAnsi="Garamond"/>
-        </w:rPr>
-        <w:t>Franceschini</w:t>
-      </w:r>
-      <w:proofErr w:type="spellEnd"/>
-      <w:r>
-        <w:rPr>
-          <w:rFonts w:ascii="Garamond" w:hAnsi="Garamond"/>
-        </w:rPr>
-        <w:t xml:space="preserve">, C. (2019, September). Behavioral economics of food and social reinforcement [Paper presentation]. </w:t>
+        <w:t xml:space="preserve"> &amp; Franceschini, C. (2019, September). Behavioral economics of food and social reinforcement [Paper presentation]. </w:t>
       </w:r>
       <w:r>
         <w:rPr>
@@ -6452,21 +6290,7 @@
         <w:rPr>
           <w:rFonts w:ascii="Garamond" w:hAnsi="Garamond"/>
         </w:rPr>
-        <w:t xml:space="preserve"> Kirkman, C. F., </w:t>
-      </w:r>
-      <w:proofErr w:type="spellStart"/>
-      <w:r>
-        <w:rPr>
-          <w:rFonts w:ascii="Garamond" w:hAnsi="Garamond"/>
-        </w:rPr>
-        <w:t>Franceschini</w:t>
-      </w:r>
-      <w:proofErr w:type="spellEnd"/>
-      <w:r>
-        <w:rPr>
-          <w:rFonts w:ascii="Garamond" w:hAnsi="Garamond"/>
-        </w:rPr>
-        <w:t xml:space="preserve">, C., &amp; Hackenberg, T. D. (2018, April). Failure to find altruistic behavior in rats [Poster presentation]. </w:t>
+        <w:t xml:space="preserve"> Kirkman, C. F., Franceschini, C., &amp; Hackenberg, T. D. (2018, April). Failure to find altruistic behavior in rats [Poster presentation]. </w:t>
       </w:r>
       <w:r>
         <w:rPr>
@@ -8580,35 +8404,67 @@
         <w:ind w:left="288" w:hanging="288"/>
         <w:rPr>
           <w:rFonts w:ascii="Garamond" w:hAnsi="Garamond"/>
+          <w:color w:val="000000"/>
+          <w:kern w:val="1"/>
+        </w:rPr>
+      </w:pPr>
+      <w:r>
+        <w:rPr>
+          <w:rFonts w:ascii="Garamond" w:hAnsi="Garamond"/>
+          <w:color w:val="000000"/>
+          <w:kern w:val="1"/>
+        </w:rPr>
+        <w:t>Chen</w:t>
+      </w:r>
+      <w:r>
+        <w:rPr>
+          <w:rFonts w:ascii="Garamond" w:hAnsi="Garamond"/>
+          <w:color w:val="000000"/>
+          <w:kern w:val="1"/>
+        </w:rPr>
+        <w:t xml:space="preserve">, </w:t>
+      </w:r>
+      <w:r>
+        <w:rPr>
+          <w:rFonts w:ascii="Garamond" w:hAnsi="Garamond"/>
+          <w:color w:val="000000"/>
+          <w:kern w:val="1"/>
+        </w:rPr>
+        <w:t>D</w:t>
+      </w:r>
+      <w:r>
+        <w:rPr>
+          <w:rFonts w:ascii="Garamond" w:hAnsi="Garamond"/>
+          <w:color w:val="000000"/>
+          <w:kern w:val="1"/>
+        </w:rPr>
+        <w:t>. (</w:t>
+      </w:r>
+      <w:r>
+        <w:rPr>
+          <w:rFonts w:ascii="Garamond" w:hAnsi="Garamond"/>
+          <w:color w:val="000000"/>
+          <w:kern w:val="1"/>
+        </w:rPr>
+        <w:t>2025</w:t>
+      </w:r>
+      <w:r>
+        <w:rPr>
+          <w:rFonts w:ascii="Garamond" w:hAnsi="Garamond"/>
+          <w:color w:val="000000"/>
+          <w:kern w:val="1"/>
+        </w:rPr>
+        <w:t xml:space="preserve">). </w:t>
+      </w:r>
+      <w:r>
+        <w:rPr>
+          <w:rFonts w:ascii="Garamond" w:hAnsi="Garamond"/>
           <w:i/>
           <w:iCs/>
           <w:color w:val="000000"/>
           <w:kern w:val="1"/>
         </w:rPr>
-      </w:pPr>
-      <w:r>
-        <w:rPr>
-          <w:rFonts w:ascii="Garamond" w:hAnsi="Garamond"/>
-          <w:color w:val="000000"/>
-          <w:kern w:val="1"/>
-        </w:rPr>
-        <w:t>Chen</w:t>
-      </w:r>
-      <w:r>
-        <w:rPr>
-          <w:rFonts w:ascii="Garamond" w:hAnsi="Garamond"/>
-          <w:color w:val="000000"/>
-          <w:kern w:val="1"/>
-        </w:rPr>
-        <w:t xml:space="preserve">, </w:t>
-      </w:r>
-      <w:r>
-        <w:rPr>
-          <w:rFonts w:ascii="Garamond" w:hAnsi="Garamond"/>
-          <w:color w:val="000000"/>
-          <w:kern w:val="1"/>
-        </w:rPr>
-        <w:t>D</w:t>
+        <w:t>Age, Income, and the Discounting of Delayed Monetary Losses</w:t>
       </w:r>
       <w:r>
         <w:rPr>
@@ -8624,17 +8480,21 @@
           <w:color w:val="000000"/>
           <w:kern w:val="1"/>
         </w:rPr>
-        <w:t>2025</w:t>
-      </w:r>
-      <w:r>
-        <w:rPr>
-          <w:rFonts w:ascii="Garamond" w:hAnsi="Garamond"/>
-          <w:color w:val="000000"/>
-          <w:kern w:val="1"/>
-        </w:rPr>
-        <w:t xml:space="preserve">). </w:t>
-      </w:r>
-      <w:r>
+        <w:t>Research Project</w:t>
+      </w:r>
+      <w:r>
+        <w:rPr>
+          <w:rFonts w:ascii="Garamond" w:hAnsi="Garamond"/>
+          <w:color w:val="000000"/>
+          <w:kern w:val="1"/>
+        </w:rPr>
+        <w:t>, Washington University in St. Louis).</w:t>
+      </w:r>
+    </w:p>
+    <w:p>
+      <w:pPr>
+        <w:spacing w:line="276" w:lineRule="auto"/>
+        <w:ind w:left="288" w:hanging="288"/>
         <w:rPr>
           <w:rFonts w:ascii="Garamond" w:hAnsi="Garamond"/>
           <w:i/>
@@ -8642,15 +8502,40 @@
           <w:color w:val="000000"/>
           <w:kern w:val="1"/>
         </w:rPr>
-        <w:t>Age, Income, and the Discounting of Delayed Monetary Losses</w:t>
-      </w:r>
-      <w:r>
-        <w:rPr>
-          <w:rFonts w:ascii="Garamond" w:hAnsi="Garamond"/>
-          <w:color w:val="000000"/>
-          <w:kern w:val="1"/>
-        </w:rPr>
-        <w:t>. (</w:t>
+      </w:pPr>
+      <w:r>
+        <w:rPr>
+          <w:rFonts w:ascii="Garamond" w:hAnsi="Garamond"/>
+          <w:color w:val="000000"/>
+          <w:kern w:val="1"/>
+        </w:rPr>
+        <w:t xml:space="preserve">Salazar, S. (2024). </w:t>
+      </w:r>
+      <w:r>
+        <w:rPr>
+          <w:rFonts w:ascii="Garamond" w:hAnsi="Garamond"/>
+          <w:i/>
+          <w:iCs/>
+          <w:color w:val="000000"/>
+          <w:kern w:val="1"/>
+        </w:rPr>
+        <w:t>From Simple to Complex: The Predictive Validity of Reward Discounting in Financial and Health Domains</w:t>
+      </w:r>
+      <w:r>
+        <w:rPr>
+          <w:rFonts w:ascii="Garamond" w:hAnsi="Garamond"/>
+          <w:color w:val="000000"/>
+          <w:kern w:val="1"/>
+        </w:rPr>
+        <w:t xml:space="preserve">. </w:t>
+      </w:r>
+      <w:r>
+        <w:rPr>
+          <w:rFonts w:ascii="Garamond" w:hAnsi="Garamond"/>
+          <w:color w:val="000000"/>
+          <w:kern w:val="1"/>
+        </w:rPr>
+        <w:t>(</w:t>
       </w:r>
       <w:r>
         <w:rPr>
@@ -8719,7 +8604,29 @@
           <w:color w:val="000000"/>
           <w:kern w:val="1"/>
         </w:rPr>
-        <w:t>set)?: A Subjective Examination of Scarcity Theory</w:t>
+        <w:t>set</w:t>
+      </w:r>
+      <w:proofErr w:type="gramStart"/>
+      <w:r>
+        <w:rPr>
+          <w:rFonts w:ascii="Garamond" w:hAnsi="Garamond"/>
+          <w:i/>
+          <w:iCs/>
+          <w:color w:val="000000"/>
+          <w:kern w:val="1"/>
+        </w:rPr>
+        <w:t>)?:</w:t>
+      </w:r>
+      <w:proofErr w:type="gramEnd"/>
+      <w:r>
+        <w:rPr>
+          <w:rFonts w:ascii="Garamond" w:hAnsi="Garamond"/>
+          <w:i/>
+          <w:iCs/>
+          <w:color w:val="000000"/>
+          <w:kern w:val="1"/>
+        </w:rPr>
+        <w:t xml:space="preserve"> A Subjective Examination of Scarcity Theory</w:t>
       </w:r>
       <w:r>
         <w:rPr>
@@ -8817,7 +8724,6 @@
     </w:p>
     <w:p>
       <w:pPr>
-        <w:spacing w:before="240" w:line="276" w:lineRule="auto"/>
         <w:rPr>
           <w:rFonts w:ascii="Garamond" w:hAnsi="Garamond"/>
           <w:b/>
@@ -8840,11 +8746,39 @@
           <w:sz w:val="30"/>
           <w:szCs w:val="30"/>
         </w:rPr>
-        <w:t>REFERENCE</w:t>
+        <w:br w:type="page"/>
       </w:r>
     </w:p>
     <w:p>
       <w:pPr>
+        <w:spacing w:before="240" w:line="276" w:lineRule="auto"/>
+        <w:rPr>
+          <w:rFonts w:ascii="Garamond" w:hAnsi="Garamond"/>
+          <w:b/>
+          <w:bCs/>
+          <w:color w:val="000000"/>
+          <w:spacing w:val="2"/>
+          <w:kern w:val="1"/>
+          <w:sz w:val="30"/>
+          <w:szCs w:val="30"/>
+        </w:rPr>
+      </w:pPr>
+      <w:r>
+        <w:rPr>
+          <w:rFonts w:ascii="Garamond" w:hAnsi="Garamond"/>
+          <w:b/>
+          <w:bCs/>
+          <w:color w:val="000000"/>
+          <w:spacing w:val="2"/>
+          <w:kern w:val="1"/>
+          <w:sz w:val="30"/>
+          <w:szCs w:val="30"/>
+        </w:rPr>
+        <w:t>REFERENCE</w:t>
+      </w:r>
+    </w:p>
+    <w:p>
+      <w:pPr>
         <w:spacing w:line="276" w:lineRule="auto"/>
         <w:ind w:left="288" w:hanging="288"/>
         <w:rPr>
@@ -8922,6 +8856,7 @@
           <w:color w:val="000000"/>
           <w:kern w:val="1"/>
         </w:rPr>
+        <w:lastRenderedPageBreak/>
         <w:t>Washington University in St. Louis</w:t>
       </w:r>
     </w:p>
@@ -8982,7 +8917,6 @@
           <w:color w:val="000000"/>
           <w:kern w:val="1"/>
         </w:rPr>
-        <w:lastRenderedPageBreak/>
         <w:t>Phone</w:t>
       </w:r>
       <w:r>
@@ -9481,7 +9415,7 @@
 </file>
 
 <file path=word/endnotes.xml><?xml version="1.0" encoding="utf-8"?>
-<w:endnotes xmlns:wpc="http://schemas.microsoft.com/office/word/2010/wordprocessingCanvas" xmlns:cx="http://schemas.microsoft.com/office/drawing/2014/chartex" xmlns:cx1="http://schemas.microsoft.com/office/drawing/2015/9/8/chartex" xmlns:cx2="http://schemas.microsoft.com/office/drawing/2015/10/21/chartex" xmlns:cx3="http://schemas.microsoft.com/office/drawing/2016/5/9/chartex" xmlns:cx4="http://schemas.microsoft.com/office/drawing/2016/5/10/chartex" xmlns:cx5="http://schemas.microsoft.com/office/drawing/2016/5/11/chartex" xmlns:cx6="http://schemas.microsoft.com/office/drawing/2016/5/12/chartex" xmlns:cx7="http://schemas.microsoft.com/office/drawing/2016/5/13/chartex" xmlns:cx8="http://schemas.microsoft.com/office/drawing/2016/5/14/chartex" xmlns:mc="http://schemas.openxmlformats.org/markup-compatibility/2006" xmlns:aink="http://schemas.microsoft.com/office/drawing/2016/ink" xmlns:am3d="http://schemas.microsoft.com/office/drawing/2017/model3d" xmlns:o="urn:schemas-microsoft-com:office:office" xmlns:oel="http://schemas.microsoft.com/office/2019/extlst" xmlns:r="http://schemas.openxmlformats.org/officeDocument/2006/relationships" xmlns:m="http://schemas.openxmlformats.org/officeDocument/2006/math" xmlns:v="urn:schemas-microsoft-com:vml" xmlns:wp14="http://schemas.microsoft.com/office/word/2010/wordprocessingDrawing" xmlns:wp="http://schemas.openxmlformats.org/drawingml/2006/wordprocessingDrawing" xmlns:w10="urn:schemas-microsoft-com:office:word" xmlns:w="http://schemas.openxmlformats.org/wordprocessingml/2006/main" xmlns:w14="http://schemas.microsoft.com/office/word/2010/wordml" xmlns:w15="http://schemas.microsoft.com/office/word/2012/wordml" xmlns:w16cex="http://schemas.microsoft.com/office/word/2018/wordml/cex" xmlns:w16cid="http://schemas.microsoft.com/office/word/2016/wordml/cid" xmlns:w16="http://schemas.microsoft.com/office/word/2018/wordml" xmlns:w16du="http://schemas.microsoft.com/office/word/2023/wordml/word16du" xmlns:w16sdtdh="http://schemas.microsoft.com/office/word/2020/wordml/sdtdatahash" xmlns:w16se="http://schemas.microsoft.com/office/word/2015/wordml/symex" xmlns:wpg="http://schemas.microsoft.com/office/word/2010/wordprocessingGroup" xmlns:wpi="http://schemas.microsoft.com/office/word/2010/wordprocessingInk" xmlns:wne="http://schemas.microsoft.com/office/word/2006/wordml" xmlns:wps="http://schemas.microsoft.com/office/word/2010/wordprocessingShape" mc:Ignorable="w14 w15 w16se w16cid w16 w16cex w16sdtdh w16du wp14">
+<w:endnotes xmlns:wpc="http://schemas.microsoft.com/office/word/2010/wordprocessingCanvas" xmlns:cx="http://schemas.microsoft.com/office/drawing/2014/chartex" xmlns:cx1="http://schemas.microsoft.com/office/drawing/2015/9/8/chartex" xmlns:cx2="http://schemas.microsoft.com/office/drawing/2015/10/21/chartex" xmlns:cx3="http://schemas.microsoft.com/office/drawing/2016/5/9/chartex" xmlns:cx4="http://schemas.microsoft.com/office/drawing/2016/5/10/chartex" xmlns:cx5="http://schemas.microsoft.com/office/drawing/2016/5/11/chartex" xmlns:cx6="http://schemas.microsoft.com/office/drawing/2016/5/12/chartex" xmlns:cx7="http://schemas.microsoft.com/office/drawing/2016/5/13/chartex" xmlns:cx8="http://schemas.microsoft.com/office/drawing/2016/5/14/chartex" xmlns:mc="http://schemas.openxmlformats.org/markup-compatibility/2006" xmlns:aink="http://schemas.microsoft.com/office/drawing/2016/ink" xmlns:am3d="http://schemas.microsoft.com/office/drawing/2017/model3d" xmlns:o="urn:schemas-microsoft-com:office:office" xmlns:oel="http://schemas.microsoft.com/office/2019/extlst" xmlns:r="http://schemas.openxmlformats.org/officeDocument/2006/relationships" xmlns:m="http://schemas.openxmlformats.org/officeDocument/2006/math" xmlns:v="urn:schemas-microsoft-com:vml" xmlns:wp14="http://schemas.microsoft.com/office/word/2010/wordprocessingDrawing" xmlns:wp="http://schemas.openxmlformats.org/drawingml/2006/wordprocessingDrawing" xmlns:w10="urn:schemas-microsoft-com:office:word" xmlns:w="http://schemas.openxmlformats.org/wordprocessingml/2006/main" xmlns:w14="http://schemas.microsoft.com/office/word/2010/wordml" xmlns:w15="http://schemas.microsoft.com/office/word/2012/wordml" xmlns:w16cex="http://schemas.microsoft.com/office/word/2018/wordml/cex" xmlns:w16cid="http://schemas.microsoft.com/office/word/2016/wordml/cid" xmlns:w16="http://schemas.microsoft.com/office/word/2018/wordml" xmlns:w16du="http://schemas.microsoft.com/office/word/2023/wordml/word16du" xmlns:w16sdtdh="http://schemas.microsoft.com/office/word/2020/wordml/sdtdatahash" xmlns:w16sdtfl="http://schemas.microsoft.com/office/word/2024/wordml/sdtformatlock" xmlns:w16se="http://schemas.microsoft.com/office/word/2015/wordml/symex" xmlns:wpg="http://schemas.microsoft.com/office/word/2010/wordprocessingGroup" xmlns:wpi="http://schemas.microsoft.com/office/word/2010/wordprocessingInk" xmlns:wne="http://schemas.microsoft.com/office/word/2006/wordml" xmlns:wps="http://schemas.microsoft.com/office/word/2010/wordprocessingShape" mc:Ignorable="w14 w15 w16se w16cid w16 w16cex w16sdtdh w16sdtfl w16du wp14">
   <w:endnote w:type="separator" w:id="-1">
     <w:p>
       <w:r>
@@ -9503,7 +9437,7 @@
 </file>
 
 <file path=word/footnotes.xml><?xml version="1.0" encoding="utf-8"?>
-<w:footnotes xmlns:wpc="http://schemas.microsoft.com/office/word/2010/wordprocessingCanvas" xmlns:cx="http://schemas.microsoft.com/office/drawing/2014/chartex" xmlns:cx1="http://schemas.microsoft.com/office/drawing/2015/9/8/chartex" xmlns:cx2="http://schemas.microsoft.com/office/drawing/2015/10/21/chartex" xmlns:cx3="http://schemas.microsoft.com/office/drawing/2016/5/9/chartex" xmlns:cx4="http://schemas.microsoft.com/office/drawing/2016/5/10/chartex" xmlns:cx5="http://schemas.microsoft.com/office/drawing/2016/5/11/chartex" xmlns:cx6="http://schemas.microsoft.com/office/drawing/2016/5/12/chartex" xmlns:cx7="http://schemas.microsoft.com/office/drawing/2016/5/13/chartex" xmlns:cx8="http://schemas.microsoft.com/office/drawing/2016/5/14/chartex" xmlns:mc="http://schemas.openxmlformats.org/markup-compatibility/2006" xmlns:aink="http://schemas.microsoft.com/office/drawing/2016/ink" xmlns:am3d="http://schemas.microsoft.com/office/drawing/2017/model3d" xmlns:o="urn:schemas-microsoft-com:office:office" xmlns:oel="http://schemas.microsoft.com/office/2019/extlst" xmlns:r="http://schemas.openxmlformats.org/officeDocument/2006/relationships" xmlns:m="http://schemas.openxmlformats.org/officeDocument/2006/math" xmlns:v="urn:schemas-microsoft-com:vml" xmlns:wp14="http://schemas.microsoft.com/office/word/2010/wordprocessingDrawing" xmlns:wp="http://schemas.openxmlformats.org/drawingml/2006/wordprocessingDrawing" xmlns:w10="urn:schemas-microsoft-com:office:word" xmlns:w="http://schemas.openxmlformats.org/wordprocessingml/2006/main" xmlns:w14="http://schemas.microsoft.com/office/word/2010/wordml" xmlns:w15="http://schemas.microsoft.com/office/word/2012/wordml" xmlns:w16cex="http://schemas.microsoft.com/office/word/2018/wordml/cex" xmlns:w16cid="http://schemas.microsoft.com/office/word/2016/wordml/cid" xmlns:w16="http://schemas.microsoft.com/office/word/2018/wordml" xmlns:w16du="http://schemas.microsoft.com/office/word/2023/wordml/word16du" xmlns:w16sdtdh="http://schemas.microsoft.com/office/word/2020/wordml/sdtdatahash" xmlns:w16se="http://schemas.microsoft.com/office/word/2015/wordml/symex" xmlns:wpg="http://schemas.microsoft.com/office/word/2010/wordprocessingGroup" xmlns:wpi="http://schemas.microsoft.com/office/word/2010/wordprocessingInk" xmlns:wne="http://schemas.microsoft.com/office/word/2006/wordml" xmlns:wps="http://schemas.microsoft.com/office/word/2010/wordprocessingShape" mc:Ignorable="w14 w15 w16se w16cid w16 w16cex w16sdtdh w16du wp14">
+<w:footnotes xmlns:wpc="http://schemas.microsoft.com/office/word/2010/wordprocessingCanvas" xmlns:cx="http://schemas.microsoft.com/office/drawing/2014/chartex" xmlns:cx1="http://schemas.microsoft.com/office/drawing/2015/9/8/chartex" xmlns:cx2="http://schemas.microsoft.com/office/drawing/2015/10/21/chartex" xmlns:cx3="http://schemas.microsoft.com/office/drawing/2016/5/9/chartex" xmlns:cx4="http://schemas.microsoft.com/office/drawing/2016/5/10/chartex" xmlns:cx5="http://schemas.microsoft.com/office/drawing/2016/5/11/chartex" xmlns:cx6="http://schemas.microsoft.com/office/drawing/2016/5/12/chartex" xmlns:cx7="http://schemas.microsoft.com/office/drawing/2016/5/13/chartex" xmlns:cx8="http://schemas.microsoft.com/office/drawing/2016/5/14/chartex" xmlns:mc="http://schemas.openxmlformats.org/markup-compatibility/2006" xmlns:aink="http://schemas.microsoft.com/office/drawing/2016/ink" xmlns:am3d="http://schemas.microsoft.com/office/drawing/2017/model3d" xmlns:o="urn:schemas-microsoft-com:office:office" xmlns:oel="http://schemas.microsoft.com/office/2019/extlst" xmlns:r="http://schemas.openxmlformats.org/officeDocument/2006/relationships" xmlns:m="http://schemas.openxmlformats.org/officeDocument/2006/math" xmlns:v="urn:schemas-microsoft-com:vml" xmlns:wp14="http://schemas.microsoft.com/office/word/2010/wordprocessingDrawing" xmlns:wp="http://schemas.openxmlformats.org/drawingml/2006/wordprocessingDrawing" xmlns:w10="urn:schemas-microsoft-com:office:word" xmlns:w="http://schemas.openxmlformats.org/wordprocessingml/2006/main" xmlns:w14="http://schemas.microsoft.com/office/word/2010/wordml" xmlns:w15="http://schemas.microsoft.com/office/word/2012/wordml" xmlns:w16cex="http://schemas.microsoft.com/office/word/2018/wordml/cex" xmlns:w16cid="http://schemas.microsoft.com/office/word/2016/wordml/cid" xmlns:w16="http://schemas.microsoft.com/office/word/2018/wordml" xmlns:w16du="http://schemas.microsoft.com/office/word/2023/wordml/word16du" xmlns:w16sdtdh="http://schemas.microsoft.com/office/word/2020/wordml/sdtdatahash" xmlns:w16sdtfl="http://schemas.microsoft.com/office/word/2024/wordml/sdtformatlock" xmlns:w16se="http://schemas.microsoft.com/office/word/2015/wordml/symex" xmlns:wpg="http://schemas.microsoft.com/office/word/2010/wordprocessingGroup" xmlns:wpi="http://schemas.microsoft.com/office/word/2010/wordprocessingInk" xmlns:wne="http://schemas.microsoft.com/office/word/2006/wordml" xmlns:wps="http://schemas.microsoft.com/office/word/2010/wordprocessingShape" mc:Ignorable="w14 w15 w16se w16cid w16 w16cex w16sdtdh w16sdtfl w16du wp14">
   <w:footnote w:type="separator" w:id="-1">
     <w:p>
       <w:r>
@@ -9525,7 +9459,7 @@
 </file>
 
 <file path=word/header1.xml><?xml version="1.0" encoding="utf-8"?>
-<w:hdr xmlns:wpc="http://schemas.microsoft.com/office/word/2010/wordprocessingCanvas" xmlns:cx="http://schemas.microsoft.com/office/drawing/2014/chartex" xmlns:cx1="http://schemas.microsoft.com/office/drawing/2015/9/8/chartex" xmlns:cx2="http://schemas.microsoft.com/office/drawing/2015/10/21/chartex" xmlns:cx3="http://schemas.microsoft.com/office/drawing/2016/5/9/chartex" xmlns:cx4="http://schemas.microsoft.com/office/drawing/2016/5/10/chartex" xmlns:cx5="http://schemas.microsoft.com/office/drawing/2016/5/11/chartex" xmlns:cx6="http://schemas.microsoft.com/office/drawing/2016/5/12/chartex" xmlns:cx7="http://schemas.microsoft.com/office/drawing/2016/5/13/chartex" xmlns:cx8="http://schemas.microsoft.com/office/drawing/2016/5/14/chartex" xmlns:mc="http://schemas.openxmlformats.org/markup-compatibility/2006" xmlns:aink="http://schemas.microsoft.com/office/drawing/2016/ink" xmlns:am3d="http://schemas.microsoft.com/office/drawing/2017/model3d" xmlns:o="urn:schemas-microsoft-com:office:office" xmlns:oel="http://schemas.microsoft.com/office/2019/extlst" xmlns:r="http://schemas.openxmlformats.org/officeDocument/2006/relationships" xmlns:m="http://schemas.openxmlformats.org/officeDocument/2006/math" xmlns:v="urn:schemas-microsoft-com:vml" xmlns:wp14="http://schemas.microsoft.com/office/word/2010/wordprocessingDrawing" xmlns:wp="http://schemas.openxmlformats.org/drawingml/2006/wordprocessingDrawing" xmlns:w10="urn:schemas-microsoft-com:office:word" xmlns:w="http://schemas.openxmlformats.org/wordprocessingml/2006/main" xmlns:w14="http://schemas.microsoft.com/office/word/2010/wordml" xmlns:w15="http://schemas.microsoft.com/office/word/2012/wordml" xmlns:w16cex="http://schemas.microsoft.com/office/word/2018/wordml/cex" xmlns:w16cid="http://schemas.microsoft.com/office/word/2016/wordml/cid" xmlns:w16="http://schemas.microsoft.com/office/word/2018/wordml" xmlns:w16du="http://schemas.microsoft.com/office/word/2023/wordml/word16du" xmlns:w16sdtdh="http://schemas.microsoft.com/office/word/2020/wordml/sdtdatahash" xmlns:w16se="http://schemas.microsoft.com/office/word/2015/wordml/symex" xmlns:wpg="http://schemas.microsoft.com/office/word/2010/wordprocessingGroup" xmlns:wpi="http://schemas.microsoft.com/office/word/2010/wordprocessingInk" xmlns:wne="http://schemas.microsoft.com/office/word/2006/wordml" xmlns:wps="http://schemas.microsoft.com/office/word/2010/wordprocessingShape" mc:Ignorable="w14 w15 w16se w16cid w16 w16cex w16sdtdh w16du wp14">
+<w:hdr xmlns:wpc="http://schemas.microsoft.com/office/word/2010/wordprocessingCanvas" xmlns:cx="http://schemas.microsoft.com/office/drawing/2014/chartex" xmlns:cx1="http://schemas.microsoft.com/office/drawing/2015/9/8/chartex" xmlns:cx2="http://schemas.microsoft.com/office/drawing/2015/10/21/chartex" xmlns:cx3="http://schemas.microsoft.com/office/drawing/2016/5/9/chartex" xmlns:cx4="http://schemas.microsoft.com/office/drawing/2016/5/10/chartex" xmlns:cx5="http://schemas.microsoft.com/office/drawing/2016/5/11/chartex" xmlns:cx6="http://schemas.microsoft.com/office/drawing/2016/5/12/chartex" xmlns:cx7="http://schemas.microsoft.com/office/drawing/2016/5/13/chartex" xmlns:cx8="http://schemas.microsoft.com/office/drawing/2016/5/14/chartex" xmlns:mc="http://schemas.openxmlformats.org/markup-compatibility/2006" xmlns:aink="http://schemas.microsoft.com/office/drawing/2016/ink" xmlns:am3d="http://schemas.microsoft.com/office/drawing/2017/model3d" xmlns:o="urn:schemas-microsoft-com:office:office" xmlns:oel="http://schemas.microsoft.com/office/2019/extlst" xmlns:r="http://schemas.openxmlformats.org/officeDocument/2006/relationships" xmlns:m="http://schemas.openxmlformats.org/officeDocument/2006/math" xmlns:v="urn:schemas-microsoft-com:vml" xmlns:wp14="http://schemas.microsoft.com/office/word/2010/wordprocessingDrawing" xmlns:wp="http://schemas.openxmlformats.org/drawingml/2006/wordprocessingDrawing" xmlns:w10="urn:schemas-microsoft-com:office:word" xmlns:w="http://schemas.openxmlformats.org/wordprocessingml/2006/main" xmlns:w14="http://schemas.microsoft.com/office/word/2010/wordml" xmlns:w15="http://schemas.microsoft.com/office/word/2012/wordml" xmlns:w16cex="http://schemas.microsoft.com/office/word/2018/wordml/cex" xmlns:w16cid="http://schemas.microsoft.com/office/word/2016/wordml/cid" xmlns:w16="http://schemas.microsoft.com/office/word/2018/wordml" xmlns:w16du="http://schemas.microsoft.com/office/word/2023/wordml/word16du" xmlns:w16sdtdh="http://schemas.microsoft.com/office/word/2020/wordml/sdtdatahash" xmlns:w16sdtfl="http://schemas.microsoft.com/office/word/2024/wordml/sdtformatlock" xmlns:w16se="http://schemas.microsoft.com/office/word/2015/wordml/symex" xmlns:wpg="http://schemas.microsoft.com/office/word/2010/wordprocessingGroup" xmlns:wpi="http://schemas.microsoft.com/office/word/2010/wordprocessingInk" xmlns:wne="http://schemas.microsoft.com/office/word/2006/wordml" xmlns:wps="http://schemas.microsoft.com/office/word/2010/wordprocessingShape" mc:Ignorable="w14 w15 w16se w16cid w16 w16cex w16sdtdh w16sdtfl w16du wp14">
   <w:sdt>
     <w:sdtPr>
       <w:rPr>
@@ -9588,7 +9522,7 @@
 </file>
 
 <file path=word/numbering.xml><?xml version="1.0" encoding="utf-8"?>
-<w:numbering xmlns:wpc="http://schemas.microsoft.com/office/word/2010/wordprocessingCanvas" xmlns:cx="http://schemas.microsoft.com/office/drawing/2014/chartex" xmlns:cx1="http://schemas.microsoft.com/office/drawing/2015/9/8/chartex" xmlns:cx2="http://schemas.microsoft.com/office/drawing/2015/10/21/chartex" xmlns:cx3="http://schemas.microsoft.com/office/drawing/2016/5/9/chartex" xmlns:cx4="http://schemas.microsoft.com/office/drawing/2016/5/10/chartex" xmlns:cx5="http://schemas.microsoft.com/office/drawing/2016/5/11/chartex" xmlns:cx6="http://schemas.microsoft.com/office/drawing/2016/5/12/chartex" xmlns:cx7="http://schemas.microsoft.com/office/drawing/2016/5/13/chartex" xmlns:cx8="http://schemas.microsoft.com/office/drawing/2016/5/14/chartex" xmlns:mc="http://schemas.openxmlformats.org/markup-compatibility/2006" xmlns:aink="http://schemas.microsoft.com/office/drawing/2016/ink" xmlns:am3d="http://schemas.microsoft.com/office/drawing/2017/model3d" xmlns:o="urn:schemas-microsoft-com:office:office" xmlns:oel="http://schemas.microsoft.com/office/2019/extlst" xmlns:r="http://schemas.openxmlformats.org/officeDocument/2006/relationships" xmlns:m="http://schemas.openxmlformats.org/officeDocument/2006/math" xmlns:v="urn:schemas-microsoft-com:vml" xmlns:wp14="http://schemas.microsoft.com/office/word/2010/wordprocessingDrawing" xmlns:wp="http://schemas.openxmlformats.org/drawingml/2006/wordprocessingDrawing" xmlns:w10="urn:schemas-microsoft-com:office:word" xmlns:w="http://schemas.openxmlformats.org/wordprocessingml/2006/main" xmlns:w14="http://schemas.microsoft.com/office/word/2010/wordml" xmlns:w15="http://schemas.microsoft.com/office/word/2012/wordml" xmlns:w16cex="http://schemas.microsoft.com/office/word/2018/wordml/cex" xmlns:w16cid="http://schemas.microsoft.com/office/word/2016/wordml/cid" xmlns:w16="http://schemas.microsoft.com/office/word/2018/wordml" xmlns:w16du="http://schemas.microsoft.com/office/word/2023/wordml/word16du" xmlns:w16sdtdh="http://schemas.microsoft.com/office/word/2020/wordml/sdtdatahash" xmlns:w16se="http://schemas.microsoft.com/office/word/2015/wordml/symex" xmlns:wpg="http://schemas.microsoft.com/office/word/2010/wordprocessingGroup" xmlns:wpi="http://schemas.microsoft.com/office/word/2010/wordprocessingInk" xmlns:wne="http://schemas.microsoft.com/office/word/2006/wordml" xmlns:wps="http://schemas.microsoft.com/office/word/2010/wordprocessingShape" mc:Ignorable="w14 w15 w16se w16cid w16 w16cex w16sdtdh w16du wp14">
+<w:numbering xmlns:wpc="http://schemas.microsoft.com/office/word/2010/wordprocessingCanvas" xmlns:cx="http://schemas.microsoft.com/office/drawing/2014/chartex" xmlns:cx1="http://schemas.microsoft.com/office/drawing/2015/9/8/chartex" xmlns:cx2="http://schemas.microsoft.com/office/drawing/2015/10/21/chartex" xmlns:cx3="http://schemas.microsoft.com/office/drawing/2016/5/9/chartex" xmlns:cx4="http://schemas.microsoft.com/office/drawing/2016/5/10/chartex" xmlns:cx5="http://schemas.microsoft.com/office/drawing/2016/5/11/chartex" xmlns:cx6="http://schemas.microsoft.com/office/drawing/2016/5/12/chartex" xmlns:cx7="http://schemas.microsoft.com/office/drawing/2016/5/13/chartex" xmlns:cx8="http://schemas.microsoft.com/office/drawing/2016/5/14/chartex" xmlns:mc="http://schemas.openxmlformats.org/markup-compatibility/2006" xmlns:aink="http://schemas.microsoft.com/office/drawing/2016/ink" xmlns:am3d="http://schemas.microsoft.com/office/drawing/2017/model3d" xmlns:o="urn:schemas-microsoft-com:office:office" xmlns:oel="http://schemas.microsoft.com/office/2019/extlst" xmlns:r="http://schemas.openxmlformats.org/officeDocument/2006/relationships" xmlns:m="http://schemas.openxmlformats.org/officeDocument/2006/math" xmlns:v="urn:schemas-microsoft-com:vml" xmlns:wp14="http://schemas.microsoft.com/office/word/2010/wordprocessingDrawing" xmlns:wp="http://schemas.openxmlformats.org/drawingml/2006/wordprocessingDrawing" xmlns:w10="urn:schemas-microsoft-com:office:word" xmlns:w="http://schemas.openxmlformats.org/wordprocessingml/2006/main" xmlns:w14="http://schemas.microsoft.com/office/word/2010/wordml" xmlns:w15="http://schemas.microsoft.com/office/word/2012/wordml" xmlns:w16cex="http://schemas.microsoft.com/office/word/2018/wordml/cex" xmlns:w16cid="http://schemas.microsoft.com/office/word/2016/wordml/cid" xmlns:w16="http://schemas.microsoft.com/office/word/2018/wordml" xmlns:w16du="http://schemas.microsoft.com/office/word/2023/wordml/word16du" xmlns:w16sdtdh="http://schemas.microsoft.com/office/word/2020/wordml/sdtdatahash" xmlns:w16sdtfl="http://schemas.microsoft.com/office/word/2024/wordml/sdtformatlock" xmlns:w16se="http://schemas.microsoft.com/office/word/2015/wordml/symex" xmlns:wpg="http://schemas.microsoft.com/office/word/2010/wordprocessingGroup" xmlns:wpi="http://schemas.microsoft.com/office/word/2010/wordprocessingInk" xmlns:wne="http://schemas.microsoft.com/office/word/2006/wordml" xmlns:wps="http://schemas.microsoft.com/office/word/2010/wordprocessingShape" mc:Ignorable="w14 w15 w16se w16cid w16 w16cex w16sdtdh w16sdtfl w16du wp14">
   <w:abstractNum w:abstractNumId="0" w15:restartNumberingAfterBreak="0">
     <w:nsid w:val="0D43701F"/>
     <w:multiLevelType w:val="hybridMultilevel"/>
@@ -11040,7 +10974,7 @@
 </file>
 
 <file path=word/styles.xml><?xml version="1.0" encoding="utf-8"?>
-<w:styles xmlns:mc="http://schemas.openxmlformats.org/markup-compatibility/2006" xmlns:r="http://schemas.openxmlformats.org/officeDocument/2006/relationships" xmlns:w="http://schemas.openxmlformats.org/wordprocessingml/2006/main" xmlns:w14="http://schemas.microsoft.com/office/word/2010/wordml" xmlns:w15="http://schemas.microsoft.com/office/word/2012/wordml" xmlns:w16cex="http://schemas.microsoft.com/office/word/2018/wordml/cex" xmlns:w16cid="http://schemas.microsoft.com/office/word/2016/wordml/cid" xmlns:w16="http://schemas.microsoft.com/office/word/2018/wordml" xmlns:w16du="http://schemas.microsoft.com/office/word/2023/wordml/word16du" xmlns:w16sdtdh="http://schemas.microsoft.com/office/word/2020/wordml/sdtdatahash" xmlns:w16se="http://schemas.microsoft.com/office/word/2015/wordml/symex" mc:Ignorable="w14 w15 w16se w16cid w16 w16cex w16sdtdh w16du">
+<w:styles xmlns:mc="http://schemas.openxmlformats.org/markup-compatibility/2006" xmlns:r="http://schemas.openxmlformats.org/officeDocument/2006/relationships" xmlns:w="http://schemas.openxmlformats.org/wordprocessingml/2006/main" xmlns:w14="http://schemas.microsoft.com/office/word/2010/wordml" xmlns:w15="http://schemas.microsoft.com/office/word/2012/wordml" xmlns:w16cex="http://schemas.microsoft.com/office/word/2018/wordml/cex" xmlns:w16cid="http://schemas.microsoft.com/office/word/2016/wordml/cid" xmlns:w16="http://schemas.microsoft.com/office/word/2018/wordml" xmlns:w16du="http://schemas.microsoft.com/office/word/2023/wordml/word16du" xmlns:w16sdtdh="http://schemas.microsoft.com/office/word/2020/wordml/sdtdatahash" xmlns:w16sdtfl="http://schemas.microsoft.com/office/word/2024/wordml/sdtformatlock" xmlns:w16se="http://schemas.microsoft.com/office/word/2015/wordml/symex" mc:Ignorable="w14 w15 w16se w16cid w16 w16cex w16sdtdh w16sdtfl w16du">
   <w:docDefaults>
     <w:rPrDefault>
       <w:rPr>

</xml_diff>